<commit_message>
Server and firewall account setup
</commit_message>
<xml_diff>
--- a/Firewall google account.docx
+++ b/Firewall google account.docx
@@ -2,6 +2,44 @@
 <file path=word/document.xml><?xml version="1.0" encoding="utf-8"?>
 <w:document xmlns:wpc="http://schemas.microsoft.com/office/word/2010/wordprocessingCanvas" xmlns:cx="http://schemas.microsoft.com/office/drawing/2014/chartex" xmlns:cx1="http://schemas.microsoft.com/office/drawing/2015/9/8/chartex" xmlns:cx2="http://schemas.microsoft.com/office/drawing/2015/10/21/chartex" xmlns:cx3="http://schemas.microsoft.com/office/drawing/2016/5/9/chartex" xmlns:cx4="http://schemas.microsoft.com/office/drawing/2016/5/10/chartex" xmlns:cx5="http://schemas.microsoft.com/office/drawing/2016/5/11/chartex" xmlns:cx6="http://schemas.microsoft.com/office/drawing/2016/5/12/chartex" xmlns:cx7="http://schemas.microsoft.com/office/drawing/2016/5/13/chartex" xmlns:cx8="http://schemas.microsoft.com/office/drawing/2016/5/14/chartex" xmlns:mc="http://schemas.openxmlformats.org/markup-compatibility/2006" xmlns:aink="http://schemas.microsoft.com/office/drawing/2016/ink" xmlns:am3d="http://schemas.microsoft.com/office/drawing/2017/model3d" xmlns:o="urn:schemas-microsoft-com:office:office" xmlns:oel="http://schemas.microsoft.com/office/2019/extlst" xmlns:r="http://schemas.openxmlformats.org/officeDocument/2006/relationships" xmlns:m="http://schemas.openxmlformats.org/officeDocument/2006/math" xmlns:v="urn:schemas-microsoft-com:vml" xmlns:wp14="http://schemas.microsoft.com/office/word/2010/wordprocessingDrawing" xmlns:wp="http://schemas.openxmlformats.org/drawingml/2006/wordprocessingDrawing" xmlns:w10="urn:schemas-microsoft-com:office:word" xmlns:w="http://schemas.openxmlformats.org/wordprocessingml/2006/main" xmlns:w14="http://schemas.microsoft.com/office/word/2010/wordml" xmlns:w15="http://schemas.microsoft.com/office/word/2012/wordml" xmlns:w16cex="http://schemas.microsoft.com/office/word/2018/wordml/cex" xmlns:w16cid="http://schemas.microsoft.com/office/word/2016/wordml/cid" xmlns:w16="http://schemas.microsoft.com/office/word/2018/wordml" xmlns:w16du="http://schemas.microsoft.com/office/word/2023/wordml/word16du" xmlns:w16sdtdh="http://schemas.microsoft.com/office/word/2020/wordml/sdtdatahash" xmlns:w16se="http://schemas.microsoft.com/office/word/2015/wordml/symex" xmlns:wpg="http://schemas.microsoft.com/office/word/2010/wordprocessingGroup" xmlns:wpi="http://schemas.microsoft.com/office/word/2010/wordprocessingInk" xmlns:wne="http://schemas.microsoft.com/office/word/2006/wordml" xmlns:wps="http://schemas.microsoft.com/office/word/2010/wordprocessingShape" mc:Ignorable="w14 w15 w16se w16cid w16 w16cex w16sdtdh wp14">
   <w:body>
+    <w:p>
+      <w:pPr>
+        <w:rPr>
+          <w:b/>
+          <w:bCs/>
+        </w:rPr>
+      </w:pPr>
+      <w:r>
+        <w:rPr>
+          <w:b/>
+          <w:bCs/>
+        </w:rPr>
+        <w:t>Server admin – Pass word:  BIA-BHS@CSE2025</w:t>
+      </w:r>
+    </w:p>
+    <w:p>
+      <w:pPr>
+        <w:rPr>
+          <w:b/>
+          <w:bCs/>
+        </w:rPr>
+      </w:pPr>
+      <w:r>
+        <w:rPr>
+          <w:b/>
+          <w:bCs/>
+        </w:rPr>
+        <w:t>Server general user – Slts@12345</w:t>
+      </w:r>
+    </w:p>
+    <w:p>
+      <w:pPr>
+        <w:rPr>
+          <w:b/>
+          <w:bCs/>
+        </w:rPr>
+      </w:pPr>
+    </w:p>
     <w:p>
       <w:pPr>
         <w:rPr>
@@ -269,14 +307,7 @@
           <w:bCs/>
         </w:rPr>
         <w:lastRenderedPageBreak/>
-        <w:t xml:space="preserve">Pw Sophos central - </w:t>
-      </w:r>
-      <w:r>
-        <w:rPr>
-          <w:b/>
-          <w:bCs/>
-        </w:rPr>
-        <w:t>HZ3isrhftmjU9p.</w:t>
+        <w:t>Pw Sophos central - HZ3isrhftmjU9p.</w:t>
       </w:r>
     </w:p>
     <w:p>
@@ -322,7 +353,17 @@
       </w:r>
     </w:p>
     <w:p>
-      <w:r>
+      <w:pPr>
+        <w:rPr>
+          <w:b/>
+          <w:bCs/>
+        </w:rPr>
+      </w:pPr>
+      <w:r>
+        <w:rPr>
+          <w:b/>
+          <w:bCs/>
+        </w:rPr>
         <w:t>Admin setup – firewall</w:t>
       </w:r>
     </w:p>
@@ -373,11 +414,25 @@
     <w:p/>
     <w:p/>
     <w:p>
-      <w:r>
+      <w:pPr>
+        <w:rPr>
+          <w:b/>
+          <w:bCs/>
+        </w:rPr>
+      </w:pPr>
+      <w:r>
+        <w:rPr>
+          <w:b/>
+          <w:bCs/>
+        </w:rPr>
         <w:lastRenderedPageBreak/>
         <w:t>Firewall backup – pw for encryption – 200500L</w:t>
       </w:r>
       <w:r>
+        <w:rPr>
+          <w:b/>
+          <w:bCs/>
+        </w:rPr>
         <w:t>Ishara</w:t>
       </w:r>
     </w:p>
@@ -441,11 +496,44 @@
           <w:bCs/>
         </w:rPr>
       </w:pPr>
-      <w:r>
-        <w:rPr>
-          <w:b/>
-          <w:bCs/>
-        </w:rPr>
+    </w:p>
+    <w:p>
+      <w:pPr>
+        <w:rPr>
+          <w:b/>
+          <w:bCs/>
+        </w:rPr>
+      </w:pPr>
+    </w:p>
+    <w:p>
+      <w:pPr>
+        <w:rPr>
+          <w:b/>
+          <w:bCs/>
+        </w:rPr>
+      </w:pPr>
+    </w:p>
+    <w:p>
+      <w:pPr>
+        <w:rPr>
+          <w:b/>
+          <w:bCs/>
+        </w:rPr>
+      </w:pPr>
+    </w:p>
+    <w:p>
+      <w:pPr>
+        <w:rPr>
+          <w:b/>
+          <w:bCs/>
+        </w:rPr>
+      </w:pPr>
+      <w:r>
+        <w:rPr>
+          <w:b/>
+          <w:bCs/>
+        </w:rPr>
+        <w:lastRenderedPageBreak/>
         <w:t xml:space="preserve">Free demo credentials </w:t>
       </w:r>
       <w:r>
@@ -506,7 +594,6 @@
         <w:rPr>
           <w:noProof/>
         </w:rPr>
-        <w:lastRenderedPageBreak/>
         <w:drawing>
           <wp:inline distT="0" distB="0" distL="0" distR="0" wp14:anchorId="4DC2DA11" wp14:editId="16DE1887">
             <wp:extent cx="5943600" cy="4802505"/>
@@ -567,7 +654,6 @@
           <w:b/>
           <w:bCs/>
         </w:rPr>
-        <w:lastRenderedPageBreak/>
         <w:t>Firewall general user – username and name – BHSautomation</w:t>
       </w:r>
     </w:p>
@@ -583,21 +669,7 @@
           <w:b/>
           <w:bCs/>
         </w:rPr>
-        <w:t xml:space="preserve">Pw – </w:t>
-      </w:r>
-      <w:r>
-        <w:rPr>
-          <w:b/>
-          <w:bCs/>
-        </w:rPr>
-        <w:t>BHS</w:t>
-      </w:r>
-      <w:r>
-        <w:rPr>
-          <w:b/>
-          <w:bCs/>
-        </w:rPr>
-        <w:t>500200#automation</w:t>
+        <w:t>Pw – BHS500200#automation</w:t>
       </w:r>
     </w:p>
     <w:p>

</xml_diff>